<commit_message>
iki-roman: ŞAHİT v5 mit Sefas 17 Änderungen (geprüft, 11 kleine Rechtschreib-/Satzzeichenkorrekturen), Innenteil 201 S. + EPUB, Cover mit Rücken 12,76 mm, Prüfbericht TR, Änderungsliste, README
Co-Authored-By: Claude Opus 5.5 <noreply@anthropic.com>
Claude-Session: https://claude.ai/code/session_01VkFweucEM9zfUt3hW6rSer
</commit_message>
<xml_diff>
--- a/iki-roman/interior/src/SAHIT_TR_v5.docx
+++ b/iki-roman/interior/src/SAHIT_TR_v5.docx
@@ -3768,7 +3768,7 @@
           <w:color w:val="000000"/>
           <w:sz w:val="22"/>
         </w:rPr>
-        <w:t>“Bulunca haber verin,” dedim. “Ben de anahtarımı nerede aradığımı unutursam size danışayım.” Bu kez o güldü. Sonra başka bir konuya geçti. Ben de onun bıraktığı kelimenin peşinden gitmedim. O gün bunu nezaket sandım; geriye dönüp düşününce, fark etmemekle nazik olmak arasındaki farkı bilmediğimi anlıyorum. Vildan Hanım “Benden başka talebiniz yoksa müsaadenizle” dedi ve ayrıldı</w:t>
+        <w:t>“Bulunca haber verin,” dedim. “Ben de anahtarımı nerede aradığımı unutursam size danışayım.” Bu kez o güldü. Sonra başka bir konuya geçti. Ben de onun bıraktığı kelimenin peşinden gitmedim. O gün bunu nezaket sandım; geriye dönüp düşününce, fark etmemekle nazik olmak arasındaki farkı bilmediğimi anlıyorum. Vildan Hanım “Benden başka talebiniz yoksa müsaadenizle,” dedi ve ayrıldı.</w:t>
       </w:r>
     </w:p>
     <w:p>
@@ -4201,7 +4201,7 @@
           <w:color w:val="000000"/>
           <w:sz w:val="22"/>
         </w:rPr>
-        <w:t>Akşam yemeğinden sonra annem sigara odasına geçip sigarasını içti. Ben elektronik sigara kullandığım için evin her yerinde içebiliyordum. Yemekten yaklaşık bir saat sonra maden suyuna alıç sirkesi karıştırıp içerdim. O akşam da öyle yaptım. Maden suyumu bitirince ayağa kalktım. Otururken yazdığım kısa mesajı okuyup bir dostuma gönderecektim. Fakat ayağa kalkar kalkmaz parmağım gönder tuşuna basmadı. Bedenim kasılmaya başladı. Bilincim açıktı ama bedenime hâkim olamıyordum; bir ağaç kütüğü gibi yere devrildim. Gözlerimi bile oynatamıyordum; kendimi felç olmuş gibi hissettim. Nefesim kesiliyor gibiydi. Her şey kararmadan önce aklımdan geçen son cümle şuydu: “Hani ben şehit olacaktım, Allah'ım?” Sonra bilincim kapandı. Ekran hâlâ açıktı ama giderek vurulan ceylan gibi kararıyordu. Mesajım yarım kalmış, imleç yanıp sönüyordu; sanki benden önce o nefes alıyor, cümleyi tek başına tamamlamaya çalışıyordu. İçimden yardım diye bağırdığımı hatırlıyorum; sesim çıktı mı, bilmiyorum. Ne kadar süre yerde kaldığımı bilmiyorum. Bir süre sonra gözlerimi yerde açtım. Önce bulunduğum yeri anlamaya çalıştım. Halının deseni gözümün önünde yabancı bir harita gibi duruyordu; birkaç saniye sonra evde olduğunu hatırladım. Bedenim benden önce uyanmış gibiydi: kaslarım kasılıp çözülüyor, ben yalnızca seyrediyordum. Her yanım tutulmuş, ağrımaya başlamıştı. Yardım çağırmayı düşündüm ama seslenebilir miydim, emin değildim. Annem birkaç adım ötedeydi; onun yanına gitmekle kendi başıma kalkmaya çalışmak arasında, o an bana tek bir koridor kadar mesafe vardı. Midem bulanıp kusacak gibi olunca lavaboya gitmek için emeklemeye başladım. Bizim koridor ince ve uzundur; yaklaşık on beş metre. Tek endişem, koridorun sonunda oturup sigara içen, tabletinden dizi izleyen annemin beni bu hâlde görmesiydi. Banyo koridorun sonunda, sol taraftaydı. Tahmin ettiğim gibi kustum; başım dönmeye devam etse de öğürmem gerekmedi. Şükürler olsun, annem ne gördü ne duydu. Son iki yıldır az işitmeye başlamıştı; gittiğimiz doktor bunun yaşa bağlı işitme kaybı olduğunu söylemişti. Sonunda salona ulaştım ve üçlü koltuğa uzandım. Daha doğrusu, kendimi koltuğa bıraktım. Bir bacağım yerde, yüzüm koyduğum tarafa dönük, bir kolum aşağı sarkmış halde; sarhoş biri gibi yarı baygın uyuyakalmışım. Gece mi sabah mı olduğunu bilmediğim bir ara, üstüm açık ve biçimsiz yatışıma söylenen annemin sesini duydum:</w:t>
+        <w:t>Akşam yemeğinden sonra annem sigara odasına geçip sigarasını içti. Ben elektronik sigara kullandığım için evin her yerinde içebiliyordum. Yemekten yaklaşık bir saat sonra maden suyuna alıç sirkesi karıştırıp içerdim. O akşam da öyle yaptım. Maden suyumu bitirince ayağa kalktım. Otururken yazdığım kısa mesajı okuyup bir dostuma gönderecektim. Fakat ayağa kalkar kalkmaz parmağım gönder tuşuna basmadı. Bedenim kasılmaya başladı. Bilincim açıktı ama bedenime hâkim olamıyordum; bir ağaç kütüğü gibi yere devrildim. Gözlerimi bile oynatamıyordum; kendimi felç olmuş gibi hissettim. Nefesim kesiliyor gibiydi. Her şey kararmadan önce aklımdan geçen son cümle şuydu: “Hani ben şehit olacaktım, Allah'ım?” Sonra bilincim kapandı. Ekran hâlâ açıktı ama giderek vurulan ceylan gibi kararıyordu. Mesajım yarım kalmış, imleç yanıp sönüyordu; sanki benden önce o nefes alıyor, cümleyi tek başına tamamlamaya çalışıyordu. İçimden yardım diye bağırdığımı hatırlıyorum; sesim çıktı mı, bilmiyorum. Ne kadar süre yerde kaldığımı bilmiyorum. Bir süre sonra gözlerimi yerde açtım. Önce bulunduğum yeri anlamaya çalıştım. Halının deseni gözümün önünde yabancı bir harita gibi duruyordu; birkaç saniye sonra evde olduğumu hatırladım. Bedenim benden önce uyanmış gibiydi: kaslarım kasılıp çözülüyor, ben yalnızca seyrediyordum. Her yanım tutulmuş, ağrımaya başlamıştı. Yardım çağırmayı düşündüm ama seslenebilir miydim, emin değildim. Annem birkaç adım ötedeydi; onun yanına gitmekle kendi başıma kalkmaya çalışmak arasında, o an bana tek bir koridor kadar mesafe vardı. Midem bulanıp kusacak gibi olunca lavaboya gitmek için emeklemeye başladım. Bizim koridor ince ve uzundur; yaklaşık on beş metre. Tek endişem, koridorun sonunda oturup sigara içen, tabletinden dizi izleyen annemin beni bu hâlde görmesiydi. Banyo koridorun sonunda, sol taraftaydı. Tahmin ettiğim gibi kustum; başım dönmeye devam etse de öğürmem gerekmedi. Şükürler olsun, annem ne gördü ne duydu. Son iki yıldır az işitmeye başlamıştı; gittiğimiz doktor bunun yaşa bağlı işitme kaybı olduğunu söylemişti. Sonunda salona ulaştım ve üçlü koltuğa uzandım. Daha doğrusu, kendimi koltuğa bıraktım. Bir bacağım yerde, yüzüm koyduğum tarafa dönük, bir kolum aşağı sarkmış halde; sarhoş biri gibi yarı baygın uyuyakalmışım. Gece mi sabah mı olduğunu bilmediğim bir ara, üstüm açık ve biçimsiz yatışıma söylenen annemin sesini duydum:</w:t>
       </w:r>
     </w:p>
     <w:p>
@@ -4539,7 +4539,7 @@
           <w:color w:val="000000"/>
           <w:sz w:val="22"/>
         </w:rPr>
-        <w:t xml:space="preserve">Lan çocukluktan, Hoca kelimesi de beni kızdırmak içindi, gıcık ederek mutlu olurdu Mahmut ama hiç öfkelenecek dermanım yoktu. </w:t>
+        <w:t>Lan çocukluktan, Hoca kelimesi de beni kızdırmak içindi, gıcık ederek mutlu olurdu Mahmut ama hiç öfkelenecek dermanım yoktu.</w:t>
       </w:r>
     </w:p>
     <w:p>
@@ -4591,7 +4591,7 @@
           <w:color w:val="000000"/>
           <w:sz w:val="22"/>
         </w:rPr>
-        <w:t>“O geveze adama ne oldu? Geliyor, başı önünde kahvesini içiyor, gidiyor. Sadece selam, sıfır kelam”</w:t>
+        <w:t>“O geveze adama ne oldu? Geliyor, başı önünde kahvesini içiyor, gidiyor. Sadece selam, sıfır kelam.”</w:t>
       </w:r>
     </w:p>
     <w:p>
@@ -5099,7 +5099,7 @@
           <w:color w:val="000000"/>
           <w:sz w:val="22"/>
         </w:rPr>
-        <w:t>“Ben bilmem; bildik de ne oldu? Sadece sizi burada bulacağımı söylendi. Açıkçası bu kadar erken beklemiyordum. Bir hafta olur, on gün olur… Ama bu kadar erken değil.”</w:t>
+        <w:t>“Ben bilmem; bildik de ne oldu? Sadece sizi burada bulacağım söylendi. Açıkçası bu kadar erken beklemiyordum. Bir hafta olur, on gün olur… Ama bu kadar erken değil.”</w:t>
       </w:r>
     </w:p>
     <w:p>
@@ -5177,7 +5177,7 @@
           <w:color w:val="000000"/>
           <w:sz w:val="22"/>
         </w:rPr>
-        <w:t xml:space="preserve">Arkasını döner dönmez topukladı. Bir süre kapının önünde arkasından baktım, bir hayalet gibi koridor boyunca süzüldü. Kâğıtları poşetten çıkarıp masaya boca ederken kapıyı kapattım ama kilitlemeyi unuttum. Hakan Hoca, kilitli olmayan kapıları yanlışlıkla açmaya çalışanların çıkabileceğini, bunun da dikkatimi dağıtacağını söylemişti. Yazmak konsantrasyon işiydi ve adam haklıydı. </w:t>
+        <w:t>Arkasını döner dönmez topukladı. Bir süre kapının önünde arkasından baktım, bir hayalet gibi koridor boyunca süzüldü. Kâğıtları poşetten çıkarıp masaya boca ederken kapıyı kapattım ama kilitlemeyi unuttum. Hakan Hoca, kilitli olmayan kapıları yanlışlıkla açmaya çalışanların çıkabileceğini, bunun da dikkatimi dağıtacağını söylemişti. Yazmak konsantrasyon işiydi ve adam haklıydı.</w:t>
       </w:r>
     </w:p>
     <w:p>
@@ -5346,7 +5346,7 @@
           <w:color w:val="000000"/>
           <w:sz w:val="22"/>
         </w:rPr>
-        <w:t>Az önce bu yaşlı adama kâğıtları taşıma işini verdiği için Hakan Hoca'ya içimden hayıflanmıştım. Şimdi anladım: Hoca odayı benim için değiştirmişti; ama Nazım Efendi'nin hatırasını silememişti. Aynı kapı, birimiz için yeni bir başlangıç, diğeri için eski bir tecrit odasına açılıyordu.</w:t>
+        <w:t>Az önce bu yaşlı adama kâğıtları taşıma işini verdiği için Hakan Hoca'ya içimden hayıflanmıştım. Şimdi anladım: Hoca odayı benim için değiştirmişti; ama Nazım Efendi'nin hatırasını silememişti. Aynı kapı, birimiz için yeni bir başlangıca, diğeri için eski bir tecrit odasına açılıyordu.</w:t>
       </w:r>
     </w:p>
     <w:p>
@@ -5372,7 +5372,7 @@
           <w:color w:val="000000"/>
           <w:sz w:val="22"/>
         </w:rPr>
-        <w:t>“Doktorlar demek istedim hocam, sizin gibi kişiler, artık mürekkep yalamış mı dersiniz beyaz yaka mı dersiniz”</w:t>
+        <w:t>“Doktorlar demek istedim hocam, sizin gibi kişiler, artık mürekkep yalamış mı dersiniz beyaz yaka mı dersiniz.”</w:t>
       </w:r>
     </w:p>
     <w:p>
@@ -5502,7 +5502,7 @@
           <w:color w:val="000000"/>
           <w:sz w:val="22"/>
         </w:rPr>
-        <w:t>Peki insan? Allah'ın halifesi olduğu söylenen, hayvan bedeninin içine, ten kafesine hapsolmuş insan neyle kâmildi? Üremekse hayvanlar da bitkiler de ürerdi. Beşer, ten; beşeriyet de tenle ilgili değil miydi? Zekâ hayvanlarda da vardı; hatta bir demet maydanozda bile düzen vardı. Zekâ bir yazılımsa, yazılım da bir işletim sistemi değil miydi? Akıl mıydı insanı tamamlayan? Zekâyı akıldan ayıran tek şey vicdan filtresi miydi? Akıl da kâmildi, hem de en önemlilerinden. Hakikate nasıl erişirdi insan? Kendi hakikatinden vazgeçtiği yerde miydi? İman, evet iman aklının ermediği hakikate inanmak teslim olmaktı. Akıl insanı aklının aldığı yere kadar götürür ama iman aklatmediği yerde iman eder, iman ise akla takla attırıdı. Öyle olmasaydı, aklı örten alkol neden kötülüklerin anası sayılsın, Hakk'ı örtmeye madem kafirlik deniyordu, kafirin de hakikatini örten, iman etmemesiydi. Demek ki aklı örtenin haram edilmesi de bundan sebepti?</w:t>
+        <w:t>Peki insan? Allah'ın halifesi olduğu söylenen, hayvan bedeninin içine, ten kafesine hapsolmuş insan neyle kâmildi? Üremekse hayvanlar da bitkiler de ürerdi. Beşer, ten; beşeriyet de tenle ilgili değil miydi? Zekâ hayvanlarda da vardı; hatta bir demet maydanozda bile düzen vardı. Zekâ bir yazılımsa, yazılım da bir işletim sistemi değil miydi? Akıl mıydı insanı tamamlayan? Zekâyı akıldan ayıran tek şey vicdan filtresi miydi? Akıl da kâmildi, hem de en önemlilerinden. Hakikate nasıl erişirdi insan? Kendi hakikatinden vazgeçtiği yerde miydi? İman, evet iman aklının ermediği hakikate inanmak teslim olmaktı. Akıl insanı aklının aldığı yere kadar götürür ama iman akletmediği yerde iman eder, iman ise akla takla attırırdı. Öyle olmasaydı, aklı örten alkol neden kötülüklerin anası sayılsın? Hakk'ı örtmeye madem kafirlik deniyordu, kafirin de hakikatini örten, iman etmemesiydi. Demek ki aklı örtenin haram edilmesi de bundan sebepti?</w:t>
       </w:r>
     </w:p>
     <w:p>

</xml_diff>

<commit_message>
iki-roman: ŞAHİT v5 – Entscheidungen nach Autorenantwort ('en mantıklısı olsun'): 'insan aklın yetmediği yerde iman eder', Motto in HODRİ vereinheitlicht, Zehra/tecrit odası unverändert; PDF/EPUB neu, Berichte
Co-Authored-By: Claude Opus 5.5 <noreply@anthropic.com>
Claude-Session: https://claude.ai/code/session_01VkFweucEM9zfUt3hW6rSer
</commit_message>
<xml_diff>
--- a/iki-roman/interior/src/SAHIT_TR_v5.docx
+++ b/iki-roman/interior/src/SAHIT_TR_v5.docx
@@ -5502,7 +5502,7 @@
           <w:color w:val="000000"/>
           <w:sz w:val="22"/>
         </w:rPr>
-        <w:t>Peki insan? Allah'ın halifesi olduğu söylenen, hayvan bedeninin içine, ten kafesine hapsolmuş insan neyle kâmildi? Üremekse hayvanlar da bitkiler de ürerdi. Beşer, ten; beşeriyet de tenle ilgili değil miydi? Zekâ hayvanlarda da vardı; hatta bir demet maydanozda bile düzen vardı. Zekâ bir yazılımsa, yazılım da bir işletim sistemi değil miydi? Akıl mıydı insanı tamamlayan? Zekâyı akıldan ayıran tek şey vicdan filtresi miydi? Akıl da kâmildi, hem de en önemlilerinden. Hakikate nasıl erişirdi insan? Kendi hakikatinden vazgeçtiği yerde miydi? İman, evet iman aklının ermediği hakikate inanmak teslim olmaktı. Akıl insanı aklının aldığı yere kadar götürür ama iman akletmediği yerde iman eder, iman ise akla takla attırırdı. Öyle olmasaydı, aklı örten alkol neden kötülüklerin anası sayılsın? Hakk'ı örtmeye madem kafirlik deniyordu, kafirin de hakikatini örten, iman etmemesiydi. Demek ki aklı örtenin haram edilmesi de bundan sebepti?</w:t>
+        <w:t>Peki insan? Allah'ın halifesi olduğu söylenen, hayvan bedeninin içine, ten kafesine hapsolmuş insan neyle kâmildi? Üremekse hayvanlar da bitkiler de ürerdi. Beşer, ten; beşeriyet de tenle ilgili değil miydi? Zekâ hayvanlarda da vardı; hatta bir demet maydanozda bile düzen vardı. Zekâ bir yazılımsa, yazılım da bir işletim sistemi değil miydi? Akıl mıydı insanı tamamlayan? Zekâyı akıldan ayıran tek şey vicdan filtresi miydi? Akıl da kâmildi, hem de en önemlilerinden. Hakikate nasıl erişirdi insan? Kendi hakikatinden vazgeçtiği yerde miydi? İman, evet iman aklının ermediği hakikate inanmak teslim olmaktı. Akıl insanı aklının aldığı yere kadar götürür ama insan aklın yetmediği yerde iman eder, iman ise akla takla attırırdı. Öyle olmasaydı, aklı örten alkol neden kötülüklerin anası sayılsın? Hakk'ı örtmeye madem kafirlik deniyordu, kafirin de hakikatini örten, iman etmemesiydi. Demek ki aklı örtenin haram edilmesi de bundan sebepti?</w:t>
       </w:r>
     </w:p>
     <w:p>
@@ -10073,7 +10073,7 @@
           <w:color w:val="000000"/>
           <w:sz w:val="22"/>
         </w:rPr>
-        <w:t>Daha nice sözler fısıldadı bana yol boyunca anlatamam, yani anlatmam yasak olduğu için değil, o kelimeler henüz dünyaya indirilmediği için anlatamam. Anlayacağın Mustafa Sefa, Beni banktan alıp camiye taşıyan ne ceylan kılığına girmiş Hz. Azrail’di ne de Âşık olduğum hatundu. Caminin avlusunda dahi olsa, edilen dualar ile ruhumda uyanan yarım hikayemin geri kalanını bana fısıldayan vaazlar, dualar, aminlerdi. Hodri yani Mehmet kardeşini unutma, unutma ki hatırlayanlardan olasın, hatırlarsan şahidi bulacaksın, hatırlamazsan nereden buraya geldiğini, buradan nereye gideceğini bilemeyenlerden olursun maazallah. İnsan öğrenmez, hatırlar! Şahit unuttu, sen anlatınca hatırlayacak ama bunun için de senin onu bulman lazım kıymetli kardeşim. Susayanlara su, suya susayan şahit seni bekliyor, durma, oku ve sonra yaz.</w:t>
+        <w:t>Daha nice sözler fısıldadı bana yol boyunca anlatamam, yani anlatmam yasak olduğu için değil, o kelimeler henüz dünyaya indirilmediği için anlatamam. Anlayacağın Mustafa Sefa, Beni banktan alıp camiye taşıyan ne ceylan kılığına girmiş Hz. Azrail’di ne de Âşık olduğum hatundu. Caminin avlusunda dahi olsa, edilen dualar ile ruhumda uyanan yarım hikayemin geri kalanını bana fısıldayan vaazlar, dualar, aminlerdi. Hodri yani Mehmet kardeşini unutma, unutma ki hatırlayanlardan olasın, hatırlarsan şahidi bulacaksın, hatırlamazsan nereden buraya geldiğini, buradan nereye gideceğini bilemeyenlerden olursun maazallah. İnsan hakikati öğrenmez, hatırlar! Şahit unuttu, sen anlatınca hatırlayacak ama bunun için de senin onu bulman lazım kıymetli kardeşim. Susayanlara su, suya susayan şahit seni bekliyor, durma, oku ve sonra yaz.</w:t>
       </w:r>
     </w:p>
     <w:p>

</xml_diff>